<commit_message>
Corrigir resíduos 263 no SIGA_FINAL e reforçar substituições globais.
Co-authored-by: Cursor <cursoragent@cursor.com>
</commit_message>
<xml_diff>
--- a/relatorio/SIGA_FINAL.docx
+++ b/relatorio/SIGA_FINAL.docx
@@ -4260,7 +4260,7 @@
           <w:sz w:val="24"/>
           <w:szCs w:val="24"/>
         </w:rPr>
-        <w:t>Os resultados indicam concentração de atividade ilícita no Algarve e no eixo Setúbal–Lisboa. O modelo MLP obteve uma ROC-AUC de 0,93 ± 0,02 (a precisão da classe minoritária — 3,4 % marítimo — permanece modesta). Porto e Portimão cobrem 100 % do risco (MCLP k=2); para 24 h persistentes são necessários 9 AR5 com cinco ou doze bases de lançamento. O sistema apresenta ganho de patrulha de 2,13× (IC95 1,97–2,31) e 85,2 % de acerto em holdout (n=54). Geocodificação por concelho: 231/335 apreensões marítimas. Protótipo web com demonstração AIS.</w:t>
+        <w:t>Os resultados indicam concentração de atividade ilícita no Algarve e no eixo Setúbal–Lisboa. O modelo MLP obteve uma ROC-AUC de 0,93 ± 0,02 (a precisão da classe minoritária — 3,4 % marítimo — permanece modesta). Porto e Portimão cobrem 100 % do risco (MCLP k=2); para 24 h persistentes são necessários 9 AR5 (rede distribuída). O sistema apresenta ganho de patrulha de 2,13× (IC95 1,97–2,31) e 85,2 % de acerto em holdout (n=54). Geocodificação por concelho: 231/335 apreensões marítimas. Protótipo web com demonstração AIS.</w:t>
       </w:r>
       <w:proofErr w:type="spellStart"/>
       <w:r>
@@ -5328,7 +5328,7 @@
           <w:sz w:val="24"/>
           <w:szCs w:val="24"/>
         </w:rPr>
-        <w:t>The study area is discretized into 1,156 spatial cells, of which 263 are classified as high-risk (threshold 0.5).</w:t>
+        <w:t>The study area is discretized into 1,156 spatial cells, of which 274 are classified as high-risk (threshold 0.5).</w:t>
       </w:r>
       <w:proofErr w:type="spellEnd"/>
       <w:r>
@@ -29068,7 +29068,7 @@
           <w:sz w:val="24"/>
           <w:szCs w:val="24"/>
         </w:rPr>
-        <w:t>Fixado o mesmo número de células patrulhadas (263, igual ao n.º de células de alto risco), comparou-se a captura de risco entre três estratégias (Figura 22; Tabela 8):</w:t>
+        <w:t>Fixado o mesmo número de células patrulhadas (274, igual ao n.º de células de alto risco), comparou-se a captura de risco entre três estratégias (Figura 22; Tabela 8):</w:t>
       </w:r>
     </w:p>
     <w:tbl>
@@ -30178,7 +30178,7 @@
           <w:sz w:val="24"/>
           <w:szCs w:val="24"/>
         </w:rPr>
-        <w:t>Dois mapas de risco distintos. O mapa operacional classifica 263 células como alto risco. O mapa de treino do backtest (droga e imigração temporais ≤ 2022 + pesca/poluição estáticas) regista 134 células ≥ 0,5.</w:t>
+        <w:t>Dois mapas de risco distintos. O mapa operacional classifica 274 células como alto risco. O mapa de treino do backtest (droga e imigração temporais ≤ 2022 + pesca/poluição estáticas) regista 170 células ≥ 0,5.</w:t>
       </w:r>
       <w:proofErr w:type="spellStart"/>
       <w:r>
@@ -30244,7 +30244,7 @@
           <w:sz w:val="24"/>
           <w:szCs w:val="24"/>
         </w:rPr>
-        <w:t>Ganho 2,13× na patrulha. Com 263 células patrulhadas (22,8 % da grelha), o SAD captura 49,3 % da massa de risco frente a 22,8 % de uma patrulha aleatória. O índice de Gini (0,409) confirma concentração espacial: o ganho mede priorização de risco, não deteção garantida.</w:t>
+        <w:t>Ganho 2,13× na patrulha. Com 274 células patrulhadas (23,7 % da grelha), o SAD captura 50,4 % da massa de risco frente a 23,7 % de uma patrulha aleatória. O índice de Gini (0,405) confirma concentração espacial: o ganho mede priorização de risco, não deteção garantida.</w:t>
       </w:r>
     </w:p>
     <w:p>
@@ -30380,7 +30380,7 @@
           <w:sz w:val="24"/>
           <w:szCs w:val="24"/>
         </w:rPr>
-        <w:t>Sensibilidade ao limiar (Figura 25). Variar o limiar a 0,45 / 0,50 / 0,55 altera o n.º de células alto risco de 312 / 274 / 227 e o ganho SAD para 2,08× / 2,13× / 2,27×; a ordem de grandeza da frota (9 AR5) e o par MCLP Porto + Portimão mantêm-se.</w:t>
+        <w:t>Sensibilidade ao limiar (Figura 25). Variar o limiar a 0,45 / 0,50 / 0,55 altera o n.º de células alto risco de 312 / 274 / 227 e o ganho SAD para 2,05× / 2,13× / 2,23×; a ordem de grandeza da frota (9 AR5) e o par MCLP Porto + Portimão mantêm-se.</w:t>
       </w:r>
       <w:r>
         <w:rPr>

</xml_diff>